<commit_message>
Add pharmacy apprentice quote to September In Their Words
Airam supplied real learner feedback on 2 September: a pharmacy
apprentice's account of the 10-week bootcamp, CoreEd's support into
employment, and their confidence in the sector. Condensed faithfully
into the quote box in both files, with the July figures folded into
the thank-you line after it. All QA checks pass; page fills 82/93/94/91.

Co-Authored-By: Claude Fable 5 <noreply@anthropic.com>
Claude-Session: https://claude.ai/code/session_01JcPYmj4MfDpbhWQwFMiT5Q
</commit_message>
<xml_diff>
--- a/output/InTheLoop_September2026_Accessible.docx
+++ b/output/InTheLoop_September2026_Accessible.docx
@@ -434,35 +434,21 @@
           <w:sz w:val="21"/>
           <w:szCs w:val="21"/>
         </w:rPr>
-        <w:t xml:space="preserve">This space is yours.</w:t>
-      </w:r>
-    </w:p>
-    <w:p>
-      <w:pPr>
-        <w:spacing w:after="90" w:before="0" w:line="264"/>
-      </w:pPr>
-      <w:r>
-        <w:rPr>
-          <w:rFonts w:ascii="Arial" w:cs="Arial" w:eastAsia="Arial" w:hAnsi="Arial"/>
-          <w:color w:val="2F3542"/>
-          <w:sz w:val="21"/>
-          <w:szCs w:val="21"/>
-        </w:rPr>
-        <w:t xml:space="preserve">Each issue, this section carries a learner’s own words. We don’t have a quote to share this month, so instead, here’s the invitation: if a session helped, if something finally clicked, or if something needs to change, tell your tutor. With your permission, your words could open the October issue.</w:t>
-      </w:r>
-    </w:p>
-    <w:p>
-      <w:pPr>
-        <w:spacing w:after="90" w:before="0" w:line="264"/>
-      </w:pPr>
-      <w:r>
-        <w:rPr>
-          <w:rFonts w:ascii="Arial" w:cs="Arial" w:eastAsia="Arial" w:hAnsi="Arial"/>
-          <w:color w:val="2F3542"/>
-          <w:sz w:val="21"/>
-          <w:szCs w:val="21"/>
-        </w:rPr>
-        <w:t xml:space="preserve">Anything from a sentence to a few lines works, and you can stay anonymous if you prefer. What you say gets read, and it shapes how we teach.</w:t>
+        <w:t xml:space="preserve">A pharmacy apprentice’s feedback this month.</w:t>
+      </w:r>
+    </w:p>
+    <w:p>
+      <w:pPr>
+        <w:spacing w:after="90" w:before="0" w:line="264"/>
+      </w:pPr>
+      <w:r>
+        <w:rPr>
+          <w:rFonts w:ascii="Arial" w:cs="Arial" w:eastAsia="Arial" w:hAnsi="Arial"/>
+          <w:color w:val="2F3542"/>
+          <w:sz w:val="21"/>
+          <w:szCs w:val="21"/>
+        </w:rPr>
+        <w:t xml:space="preserve">This month’s words come from a pharmacy apprentice who started on the 10-week bootcamp and is now working and studying in the sector:</w:t>
       </w:r>
     </w:p>
     <w:p>
@@ -480,7 +466,7 @@
           <w:sz w:val="21"/>
           <w:szCs w:val="21"/>
         </w:rPr>
-        <w:t xml:space="preserve">Something worth sharing while we wait: seven learners completed their apprenticeship in July, six passes and one distinction, taking this academic year’s total to 39 completions. Of those 39, almost half, 46%, were awarded a distinction.</w:t>
+        <w:t xml:space="preserve">“I started with the 10-week pharmacy bootcamp, which gave me a great insight into what it would be like working in a pharmacy. My tutors, teachers and the staff at CoreEd have been especially supportive, and helped me at times when I found things a bit difficult. CoreEd helped me secure employment, which led me to start my apprenticeship. I feel very confident to be working in the pharmaceutical sector, and intend to continue developing my skills in pharmacy.”</w:t>
       </w:r>
     </w:p>
     <w:p>
@@ -498,7 +484,21 @@
           <w:sz w:val="21"/>
           <w:szCs w:val="21"/>
         </w:rPr>
-        <w:t xml:space="preserve">— July figures, CoreEd governance data</w:t>
+        <w:t xml:space="preserve">— A CoreEd pharmacy apprentice</w:t>
+      </w:r>
+    </w:p>
+    <w:p>
+      <w:pPr>
+        <w:spacing w:after="90" w:before="0" w:line="264"/>
+      </w:pPr>
+      <w:r>
+        <w:rPr>
+          <w:rFonts w:ascii="Arial" w:cs="Arial" w:eastAsia="Arial" w:hAnsi="Arial"/>
+          <w:color w:val="2F3542"/>
+          <w:sz w:val="21"/>
+          <w:szCs w:val="21"/>
+        </w:rPr>
+        <w:t xml:space="preserve">Thank you for sharing. The wider picture backs it up: seven learners completed their apprenticeship in July, six passes and one distinction, taking this year’s total to 39 completions, almost half of them, 46%, distinctions. If you’d like your words to appear here, tell your tutor.</w:t>
       </w:r>
     </w:p>
     <w:p>
@@ -653,7 +653,7 @@
         </w:rPr>
         <w:t xml:space="preserve">Open the survey here: </w:t>
       </w:r>
-      <w:hyperlink w:history="1" r:id="rIdetmttwngonwghoh_b7vtz">
+      <w:hyperlink w:history="1" r:id="rIda2bpp_kiw_dqph_wflqgx">
         <w:r>
           <w:rPr>
             <w:rStyle w:val="Hyperlink"/>
@@ -687,7 +687,7 @@
         </w:rPr>
         <w:t xml:space="preserve">We’re on Instagram too. Follow @coreedlimited at </w:t>
       </w:r>
-      <w:hyperlink w:history="1" r:id="rIdjwbcht6mrhum7z24curfp">
+      <w:hyperlink w:history="1" r:id="rIdszyjzdxsaxkzm4i42mqoz">
         <w:r>
           <w:rPr>
             <w:rStyle w:val="Hyperlink"/>
@@ -1443,7 +1443,7 @@
         </w:rPr>
         <w:t xml:space="preserve">Telephone: 07557 093701   Email: </w:t>
       </w:r>
-      <w:hyperlink w:history="1" r:id="rIdl1oamuv834bpps5lwhvg_">
+      <w:hyperlink w:history="1" r:id="rId_drpxpxamrjlcoaz_ayro">
         <w:r>
           <w:rPr>
             <w:rStyle w:val="Hyperlink"/>
@@ -1485,7 +1485,7 @@
         </w:rPr>
         <w:t xml:space="preserve">Telephone: 07912 342 367   Email: </w:t>
       </w:r>
-      <w:hyperlink w:history="1" r:id="rId8lfzyzvoslcmpfmrgrwgl">
+      <w:hyperlink w:history="1" r:id="rIduetpo2gkukfca-wahjxto">
         <w:r>
           <w:rPr>
             <w:rStyle w:val="Hyperlink"/>
@@ -1617,7 +1617,7 @@
         </w:rPr>
         <w:t xml:space="preserve">Worried about something? You can speak to Jeannette or Airam (above), or contact the ACT Early support line on 0800 011 3764 or at </w:t>
       </w:r>
-      <w:hyperlink w:history="1" r:id="rIdm9hcqninkn67oks0bt20h">
+      <w:hyperlink w:history="1" r:id="rId2vhst9p4y4khlj0tiwvva">
         <w:r>
           <w:rPr>
             <w:rStyle w:val="Hyperlink"/>

</xml_diff>

<commit_message>
Use first names only for the newsletter characters
Per Airam: drop the invented surnames (Patel, Carter, Shah) from the
character captions. Corrected in the September issue (PDF captions,
docx alt text and captions) and at the source, in the skill's brand.md
and all four templates, so future issues carry first names only.

Co-Authored-By: Claude Fable 5 <noreply@anthropic.com>
Claude-Session: https://claude.ai/code/session_01JcPYmj4MfDpbhWQwFMiT5Q
</commit_message>
<xml_diff>
--- a/output/InTheLoop_September2026_Accessible.docx
+++ b/output/InTheLoop_September2026_Accessible.docx
@@ -511,7 +511,7 @@
           <wp:inline distT="0" distB="0" distL="0" distR="0">
             <wp:extent cx="571500" cy="1028700"/>
             <wp:effectExtent t="0" r="0" b="0" l="0"/>
-            <wp:docPr id="1" name="Priya Shah, assessor" descr="Illustration of Priya Shah, a CoreEd assessor, listening attentively." title="Priya Shah, assessor"/>
+            <wp:docPr id="1" name="Priya, assessor" descr="Illustration of Priya, a CoreEd assessor, listening attentively." title="Priya, assessor"/>
             <wp:cNvGraphicFramePr>
               <a:graphicFrameLocks xmlns:a="http://schemas.openxmlformats.org/drawingml/2006/main" noChangeAspect="1"/>
             </wp:cNvGraphicFramePr>
@@ -561,7 +561,7 @@
           <w:sz w:val="18"/>
           <w:szCs w:val="18"/>
         </w:rPr>
-        <w:t xml:space="preserve">Illustration: Priya Shah, one of our assessors.</w:t>
+        <w:t xml:space="preserve">Illustration: Priya, one of our assessors.</w:t>
       </w:r>
     </w:p>
     <w:p>
@@ -653,7 +653,7 @@
         </w:rPr>
         <w:t xml:space="preserve">Open the survey here: </w:t>
       </w:r>
-      <w:hyperlink w:history="1" r:id="rIda2bpp_kiw_dqph_wflqgx">
+      <w:hyperlink w:history="1" r:id="rId3f5gmnb1zonvcmfsrcu_8">
         <w:r>
           <w:rPr>
             <w:rStyle w:val="Hyperlink"/>
@@ -687,7 +687,7 @@
         </w:rPr>
         <w:t xml:space="preserve">We’re on Instagram too. Follow @coreedlimited at </w:t>
       </w:r>
-      <w:hyperlink w:history="1" r:id="rIdszyjzdxsaxkzm4i42mqoz">
+      <w:hyperlink w:history="1" r:id="rIdeymprzsayy0om5o3tnvme">
         <w:r>
           <w:rPr>
             <w:rStyle w:val="Hyperlink"/>
@@ -718,7 +718,7 @@
           <wp:inline distT="0" distB="0" distL="0" distR="0">
             <wp:extent cx="571500" cy="857250"/>
             <wp:effectExtent t="0" r="0" b="0" l="0"/>
-            <wp:docPr id="1" name="Corrie Patel, apprentice" descr="Illustration of Corrie Patel, a CoreEd apprentice, standing proudly." title="Corrie Patel, apprentice"/>
+            <wp:docPr id="1" name="Corrie, apprentice" descr="Illustration of Corrie, a CoreEd apprentice, standing proudly." title="Corrie, apprentice"/>
             <wp:cNvGraphicFramePr>
               <a:graphicFrameLocks xmlns:a="http://schemas.openxmlformats.org/drawingml/2006/main" noChangeAspect="1"/>
             </wp:cNvGraphicFramePr>
@@ -768,7 +768,7 @@
           <w:sz w:val="18"/>
           <w:szCs w:val="18"/>
         </w:rPr>
-        <w:t xml:space="preserve">Illustration: Corrie Patel, one of our apprentices.</w:t>
+        <w:t xml:space="preserve">Illustration: Corrie, one of our apprentices.</w:t>
       </w:r>
     </w:p>
     <w:p>
@@ -906,7 +906,7 @@
           <wp:inline distT="0" distB="0" distL="0" distR="0">
             <wp:extent cx="571500" cy="876300"/>
             <wp:effectExtent t="0" r="0" b="0" l="0"/>
-            <wp:docPr id="1" name="Priya Shah, assessor" descr="Illustration of Priya Shah, a CoreEd assessor, offering supportive reassurance." title="Priya Shah, assessor"/>
+            <wp:docPr id="1" name="Priya, assessor" descr="Illustration of Priya, a CoreEd assessor, offering supportive reassurance." title="Priya, assessor"/>
             <wp:cNvGraphicFramePr>
               <a:graphicFrameLocks xmlns:a="http://schemas.openxmlformats.org/drawingml/2006/main" noChangeAspect="1"/>
             </wp:cNvGraphicFramePr>
@@ -956,7 +956,7 @@
           <w:sz w:val="18"/>
           <w:szCs w:val="18"/>
         </w:rPr>
-        <w:t xml:space="preserve">Illustration: Priya Shah, one of our assessors.</w:t>
+        <w:t xml:space="preserve">Illustration: Priya, one of our assessors.</w:t>
       </w:r>
     </w:p>
     <w:p>
@@ -1076,7 +1076,7 @@
           <wp:inline distT="0" distB="0" distL="0" distR="0">
             <wp:extent cx="571500" cy="923925"/>
             <wp:effectExtent t="0" r="0" b="0" l="0"/>
-            <wp:docPr id="1" name="Ben Carter, mentor" descr="Illustration of Ben Carter, a CoreEd mentor, giving an encouraging thumbs up." title="Ben Carter, mentor"/>
+            <wp:docPr id="1" name="Ben, mentor" descr="Illustration of Ben, a CoreEd mentor, giving an encouraging thumbs up." title="Ben, mentor"/>
             <wp:cNvGraphicFramePr>
               <a:graphicFrameLocks xmlns:a="http://schemas.openxmlformats.org/drawingml/2006/main" noChangeAspect="1"/>
             </wp:cNvGraphicFramePr>
@@ -1126,7 +1126,7 @@
           <w:sz w:val="18"/>
           <w:szCs w:val="18"/>
         </w:rPr>
-        <w:t xml:space="preserve">Illustration: Ben Carter, one of our mentors.</w:t>
+        <w:t xml:space="preserve">Illustration: Ben, one of our mentors.</w:t>
       </w:r>
     </w:p>
     <w:p>
@@ -1315,7 +1315,7 @@
           <wp:inline distT="0" distB="0" distL="0" distR="0">
             <wp:extent cx="571500" cy="857250"/>
             <wp:effectExtent t="0" r="0" b="0" l="0"/>
-            <wp:docPr id="1" name="Corrie Patel, apprentice" descr="Illustration of Corrie Patel, a CoreEd apprentice, thinking about their next step." title="Corrie Patel, apprentice"/>
+            <wp:docPr id="1" name="Corrie, apprentice" descr="Illustration of Corrie, a CoreEd apprentice, thinking about their next step." title="Corrie, apprentice"/>
             <wp:cNvGraphicFramePr>
               <a:graphicFrameLocks xmlns:a="http://schemas.openxmlformats.org/drawingml/2006/main" noChangeAspect="1"/>
             </wp:cNvGraphicFramePr>
@@ -1365,7 +1365,7 @@
           <w:sz w:val="18"/>
           <w:szCs w:val="18"/>
         </w:rPr>
-        <w:t xml:space="preserve">Illustration: Corrie Patel, one of our apprentices.</w:t>
+        <w:t xml:space="preserve">Illustration: Corrie, one of our apprentices.</w:t>
       </w:r>
     </w:p>
     <w:p>
@@ -1443,7 +1443,7 @@
         </w:rPr>
         <w:t xml:space="preserve">Telephone: 07557 093701   Email: </w:t>
       </w:r>
-      <w:hyperlink w:history="1" r:id="rId_drpxpxamrjlcoaz_ayro">
+      <w:hyperlink w:history="1" r:id="rIdb1jzdjh6kwih1xygfhzj5">
         <w:r>
           <w:rPr>
             <w:rStyle w:val="Hyperlink"/>
@@ -1485,7 +1485,7 @@
         </w:rPr>
         <w:t xml:space="preserve">Telephone: 07912 342 367   Email: </w:t>
       </w:r>
-      <w:hyperlink w:history="1" r:id="rIduetpo2gkukfca-wahjxto">
+      <w:hyperlink w:history="1" r:id="rIdh0zxiuvfh9naiknfeqi47">
         <w:r>
           <w:rPr>
             <w:rStyle w:val="Hyperlink"/>
@@ -1617,7 +1617,7 @@
         </w:rPr>
         <w:t xml:space="preserve">Worried about something? You can speak to Jeannette or Airam (above), or contact the ACT Early support line on 0800 011 3764 or at </w:t>
       </w:r>
-      <w:hyperlink w:history="1" r:id="rId2vhst9p4y4khlj0tiwvva">
+      <w:hyperlink w:history="1" r:id="rIdxaiqbabcfcluhn2raq5ek">
         <w:r>
           <w:rPr>
             <w:rStyle w:val="Hyperlink"/>

</xml_diff>